<commit_message>
Align submission documents and provenance evidence
</commit_message>
<xml_diff>
--- a/SchedX-Agent_项目说明书.docx
+++ b/SchedX-Agent_项目说明书.docx
@@ -5216,7 +5216,6 @@
       </w:pPr>
       <w:bookmarkStart w:id="8" w:name="_Toc235401062"/>
       <w:r>
-        <w:lastRenderedPageBreak/>
         <w:t xml:space="preserve">2.2 </w:t>
       </w:r>
       <w:r>
@@ -5420,19 +5419,28 @@
         <w:t xml:space="preserve">tuned </w:t>
       </w:r>
       <w:r>
-        <w:t>等控制和系统进程受到显式保护。危险操作默认</w:t>
-      </w:r>
-      <w:r>
-        <w:t xml:space="preserve"> dry-run</w:t>
-      </w:r>
-      <w:r>
-        <w:t>；只有用户明确选择真实执行时才写</w:t>
+        <w:t>等控制和系统进程受到显式保护。</w:t>
+      </w:r>
+      <w:r>
+        <w:t>危险操作支持显式</w:t>
+      </w:r>
+      <w:r>
+        <w:t xml:space="preserve"> --dry-run </w:t>
+      </w:r>
+      <w:r>
+        <w:t>预演；不传该参数时才执行真实</w:t>
       </w:r>
       <w:r>
         <w:t xml:space="preserve"> cgroup </w:t>
       </w:r>
       <w:r>
-        <w:t>或加载调度器。</w:t>
+        <w:t>写入或调度器加载，并继续受</w:t>
+      </w:r>
+      <w:r>
+        <w:t xml:space="preserve"> root </w:t>
+      </w:r>
+      <w:r>
+        <w:t>权限、目标白名单和回滚日志约束。</w:t>
       </w:r>
     </w:p>
     <w:p>
@@ -5834,7 +5842,6 @@
         <w:rPr>
           <w:sz w:val="20"/>
         </w:rPr>
-        <w:lastRenderedPageBreak/>
         <w:t>表</w:t>
       </w:r>
       <w:r>
@@ -6647,7 +6654,7 @@
               <w:rPr>
                 <w:sz w:val="19"/>
               </w:rPr>
-              <w:t>8,306</w:t>
+              <w:t>8,521</w:t>
             </w:r>
           </w:p>
         </w:tc>
@@ -6738,7 +6745,7 @@
               <w:rPr>
                 <w:sz w:val="19"/>
               </w:rPr>
-              <w:t>5</w:t>
+              <w:t>3</w:t>
             </w:r>
           </w:p>
         </w:tc>
@@ -6757,7 +6764,7 @@
               <w:rPr>
                 <w:sz w:val="19"/>
               </w:rPr>
-              <w:t>740</w:t>
+              <w:t>584</w:t>
             </w:r>
           </w:p>
         </w:tc>
@@ -6829,7 +6836,7 @@
               <w:rPr>
                 <w:sz w:val="19"/>
               </w:rPr>
-              <w:t>7</w:t>
+              <w:t>6</w:t>
             </w:r>
           </w:p>
         </w:tc>
@@ -6847,7 +6854,7 @@
               <w:rPr>
                 <w:sz w:val="19"/>
               </w:rPr>
-              <w:t>1,221</w:t>
+              <w:t>1,457</w:t>
             </w:r>
           </w:p>
         </w:tc>
@@ -6908,7 +6915,7 @@
               <w:rPr>
                 <w:sz w:val="19"/>
               </w:rPr>
-              <w:t>28</w:t>
+              <w:t>30</w:t>
             </w:r>
           </w:p>
         </w:tc>
@@ -6927,7 +6934,7 @@
               <w:rPr>
                 <w:sz w:val="19"/>
               </w:rPr>
-              <w:t>2,454</w:t>
+              <w:t>3,018</w:t>
             </w:r>
           </w:p>
         </w:tc>
@@ -6999,7 +7006,7 @@
               <w:rPr>
                 <w:sz w:val="19"/>
               </w:rPr>
-              <w:t>101</w:t>
+              <w:t>100</w:t>
             </w:r>
           </w:p>
         </w:tc>
@@ -7017,7 +7024,7 @@
               <w:rPr>
                 <w:sz w:val="19"/>
               </w:rPr>
-              <w:t>12,721</w:t>
+              <w:t>13,580</w:t>
             </w:r>
           </w:p>
         </w:tc>
@@ -7078,7 +7085,7 @@
               <w:rPr>
                 <w:sz w:val="19"/>
               </w:rPr>
-              <w:t>25</w:t>
+              <w:t>26</w:t>
             </w:r>
           </w:p>
         </w:tc>
@@ -7097,7 +7104,7 @@
               <w:rPr>
                 <w:sz w:val="19"/>
               </w:rPr>
-              <w:t>1,822</w:t>
+              <w:t>2,193</w:t>
             </w:r>
           </w:p>
         </w:tc>
@@ -7175,7 +7182,7 @@
               <w:rPr>
                 <w:sz w:val="19"/>
               </w:rPr>
-              <w:t>14,543</w:t>
+              <w:t>15,773</w:t>
             </w:r>
           </w:p>
         </w:tc>
@@ -7215,7 +7222,6 @@
         <w:rPr>
           <w:noProof/>
         </w:rPr>
-        <w:lastRenderedPageBreak/>
         <w:drawing>
           <wp:inline distT="0" distB="0" distL="0" distR="0" wp14:anchorId="4D13E018" wp14:editId="0E88E6CB">
             <wp:extent cx="5623560" cy="2655570"/>
@@ -7332,7 +7338,6 @@
         <w:rPr>
           <w:rFonts w:ascii="黑体" w:hAnsi="黑体" w:hint="eastAsia"/>
         </w:rPr>
-        <w:lastRenderedPageBreak/>
         <w:t xml:space="preserve">第 </w:t>
       </w:r>
       <w:r>
@@ -8674,14 +8679,7 @@
         <w:rPr>
           <w:rFonts w:hint="eastAsia"/>
         </w:rPr>
-        <w:t xml:space="preserve"> </w:t>
-      </w:r>
-      <w:r>
-        <w:rPr>
-          <w:rFonts w:hint="eastAsia"/>
-        </w:rPr>
-        <w:lastRenderedPageBreak/>
-        <w:t>rule_fallback</w:t>
+        <w:t xml:space="preserve"> rule_fallback</w:t>
       </w:r>
       <w:r>
         <w:rPr>
@@ -9254,7 +9252,6 @@
       </w:pPr>
       <w:bookmarkStart w:id="18" w:name="_Toc235401072"/>
       <w:r>
-        <w:lastRenderedPageBreak/>
         <w:t xml:space="preserve">3.6 </w:t>
       </w:r>
       <w:r>
@@ -9537,7 +9534,6 @@
         <w:rPr>
           <w:rFonts w:ascii="黑体" w:hAnsi="黑体" w:hint="eastAsia"/>
         </w:rPr>
-        <w:lastRenderedPageBreak/>
         <w:t xml:space="preserve">第 </w:t>
       </w:r>
       <w:r>
@@ -10252,13 +10248,25 @@
         <w:rPr>
           <w:rFonts w:hint="eastAsia"/>
         </w:rPr>
-        <w:t xml:space="preserve"> 133 </w:t>
-      </w:r>
-      <w:r>
-        <w:rPr>
-          <w:rFonts w:hint="eastAsia"/>
-        </w:rPr>
-        <w:t>项自动化测试并全部通过。测试覆盖</w:t>
+        <w:t xml:space="preserve"> </w:t>
+      </w:r>
+      <w:r>
+        <w:rPr>
+          <w:rFonts w:hint="eastAsia"/>
+        </w:rPr>
+        <w:t xml:space="preserve">141 </w:t>
+      </w:r>
+      <w:r>
+        <w:rPr>
+          <w:rFonts w:hint="eastAsia"/>
+        </w:rPr>
+        <w:t>项</w:t>
+      </w:r>
+      <w:r>
+        <w:rPr>
+          <w:rFonts w:hint="eastAsia"/>
+        </w:rPr>
+        <w:t>自动化测试并全部通过。测试覆盖</w:t>
       </w:r>
       <w:r>
         <w:rPr>
@@ -10823,7 +10831,6 @@
               <w:rPr>
                 <w:sz w:val="19"/>
               </w:rPr>
-              <w:lastRenderedPageBreak/>
               <w:t>同类权重验证</w:t>
             </w:r>
           </w:p>
@@ -12109,7 +12116,6 @@
       </w:pPr>
       <w:bookmarkStart w:id="23" w:name="_Toc235401077"/>
       <w:r>
-        <w:lastRenderedPageBreak/>
         <w:t>4.4</w:t>
       </w:r>
       <w:r>
@@ -13485,14 +13491,7 @@
         <w:rPr>
           <w:rFonts w:hint="eastAsia"/>
         </w:rPr>
-        <w:t xml:space="preserve"> </w:t>
-      </w:r>
-      <w:r>
-        <w:rPr>
-          <w:rFonts w:hint="eastAsia"/>
-        </w:rPr>
-        <w:lastRenderedPageBreak/>
-        <w:t xml:space="preserve">insufficient_p99_improvement </w:t>
+        <w:t xml:space="preserve"> insufficient_p99_improvement </w:t>
       </w:r>
       <w:r>
         <w:rPr>
@@ -13800,7 +13799,6 @@
         <w:rPr>
           <w:rFonts w:ascii="黑体" w:hAnsi="黑体" w:hint="eastAsia"/>
         </w:rPr>
-        <w:lastRenderedPageBreak/>
         <w:t xml:space="preserve">第 </w:t>
       </w:r>
       <w:r>
@@ -13969,10 +13967,19 @@
         <w:t xml:space="preserve"> Action</w:t>
       </w:r>
       <w:r>
-        <w:t>、默认</w:t>
-      </w:r>
-      <w:r>
-        <w:t xml:space="preserve"> dry-run </w:t>
+        <w:t>、</w:t>
+      </w:r>
+      <w:r>
+        <w:t>显式</w:t>
+      </w:r>
+      <w:r>
+        <w:t xml:space="preserve"> --dry-run </w:t>
+      </w:r>
+      <w:r>
+        <w:t>预演</w:t>
+      </w:r>
+      <w:r>
+        <w:t xml:space="preserve"> </w:t>
       </w:r>
       <w:r>
         <w:t>和写前日志降低风险。每个</w:t>
@@ -14726,7 +14733,6 @@
         <w:rPr>
           <w:rFonts w:ascii="黑体" w:hAnsi="黑体" w:hint="eastAsia"/>
         </w:rPr>
-        <w:lastRenderedPageBreak/>
         <w:t xml:space="preserve">第 </w:t>
       </w:r>
       <w:r>
@@ -14872,7 +14878,13 @@
         <w:rPr>
           <w:rFonts w:hint="eastAsia"/>
         </w:rPr>
-        <w:t xml:space="preserve"> 133 </w:t>
+        <w:t xml:space="preserve"> </w:t>
+      </w:r>
+      <w:r>
+        <w:rPr>
+          <w:rFonts w:hint="eastAsia"/>
+        </w:rPr>
+        <w:t xml:space="preserve">141 </w:t>
       </w:r>
       <w:r>
         <w:rPr>
@@ -15389,7 +15401,6 @@
           <w:rFonts w:ascii="黑体" w:hAnsi="黑体"/>
           <w:b/>
         </w:rPr>
-        <w:lastRenderedPageBreak/>
         <w:t>参 考</w:t>
       </w:r>
       <w:bookmarkEnd w:id="34"/>
@@ -17923,7 +17934,7 @@
 </file>
 
 <file path=customXml/itemProps1.xml><?xml version="1.0" encoding="utf-8"?>
-<ds:datastoreItem xmlns:ds="http://schemas.openxmlformats.org/officeDocument/2006/customXml" ds:itemID="{FFE4753E-3104-450F-BD4E-56F85601A3E6}">
+<ds:datastoreItem xmlns:ds="http://schemas.openxmlformats.org/officeDocument/2006/customXml" ds:itemID="{7A5515DB-892C-488C-A219-2D81CE7ED800}">
   <ds:schemaRefs>
     <ds:schemaRef ds:uri="http://schemas.openxmlformats.org/officeDocument/2006/bibliography"/>
   </ds:schemaRefs>

</xml_diff>

<commit_message>
Complete real eBPF hooks and final benchmark evidence
</commit_message>
<xml_diff>
--- a/SchedX-Agent_项目说明书.docx
+++ b/SchedX-Agent_项目说明书.docx
@@ -4588,31 +4588,7 @@
         <w:jc w:val="both"/>
       </w:pPr>
       <w:r>
-        <w:t>预留</w:t>
-      </w:r>
-      <w:r>
-        <w:t xml:space="preserve"> scheduler trace</w:t>
-      </w:r>
-      <w:r>
-        <w:t>、</w:t>
-      </w:r>
-      <w:r>
-        <w:t>network policy</w:t>
-      </w:r>
-      <w:r>
-        <w:t>、</w:t>
-      </w:r>
-      <w:r>
-        <w:t xml:space="preserve">security policy </w:t>
-      </w:r>
-      <w:r>
-        <w:t>和</w:t>
-      </w:r>
-      <w:r>
-        <w:t xml:space="preserve"> resource control eBPF hook</w:t>
-      </w:r>
-      <w:r>
-        <w:t>。</w:t>
+        <w:t>实现并接入 scheduler trace、network policy、security policy 和 resource control 四类真实 eBPF hook；策略通过受控 BPF map 下发，运行计数进入 VerifySkill，RollbackSkill 统一卸载固定程序。</w:t>
       </w:r>
     </w:p>
     <w:p>
@@ -4624,103 +4600,7 @@
         <w:rPr>
           <w:rFonts w:hint="eastAsia"/>
         </w:rPr>
-        <w:t>当前正式结论限定在</w:t>
-      </w:r>
-      <w:r>
-        <w:rPr>
-          <w:rFonts w:hint="eastAsia"/>
-        </w:rPr>
-        <w:t xml:space="preserve"> CPU </w:t>
-      </w:r>
-      <w:r>
-        <w:rPr>
-          <w:rFonts w:hint="eastAsia"/>
-        </w:rPr>
-        <w:t>竞争场景。</w:t>
-      </w:r>
-      <w:r>
-        <w:rPr>
-          <w:rFonts w:hint="eastAsia"/>
-        </w:rPr>
-        <w:t xml:space="preserve">network/security eBPF Agent </w:t>
-      </w:r>
-      <w:r>
-        <w:rPr>
-          <w:rFonts w:hint="eastAsia"/>
-        </w:rPr>
-        <w:t>仍属于扩展接口；</w:t>
-      </w:r>
-      <w:r>
-        <w:rPr>
-          <w:rFonts w:hint="eastAsia"/>
-        </w:rPr>
-        <w:t xml:space="preserve">Redis </w:t>
-      </w:r>
-      <w:r>
-        <w:rPr>
-          <w:rFonts w:hint="eastAsia"/>
-        </w:rPr>
-        <w:t>场景已有</w:t>
-      </w:r>
-      <w:r>
-        <w:rPr>
-          <w:rFonts w:hint="eastAsia"/>
-        </w:rPr>
-        <w:t xml:space="preserve"> CLI </w:t>
-      </w:r>
-      <w:r>
-        <w:rPr>
-          <w:rFonts w:hint="eastAsia"/>
-        </w:rPr>
-        <w:t>和脚本但尚未纳入本次正式性能主张。正式</w:t>
-      </w:r>
-      <w:r>
-        <w:rPr>
-          <w:rFonts w:hint="eastAsia"/>
-        </w:rPr>
-        <w:t xml:space="preserve"> Agent </w:t>
-      </w:r>
-      <w:r>
-        <w:rPr>
-          <w:rFonts w:hint="eastAsia"/>
-        </w:rPr>
-        <w:t>演示启用</w:t>
-      </w:r>
-      <w:r>
-        <w:rPr>
-          <w:rFonts w:hint="eastAsia"/>
-        </w:rPr>
-        <w:t xml:space="preserve"> DeepSeek </w:t>
-      </w:r>
-      <w:r>
-        <w:rPr>
-          <w:rFonts w:hint="eastAsia"/>
-        </w:rPr>
-        <w:t>作为语义策略提案层，模型只输出受</w:t>
-      </w:r>
-      <w:r>
-        <w:rPr>
-          <w:rFonts w:hint="eastAsia"/>
-        </w:rPr>
-        <w:t xml:space="preserve"> Schema </w:t>
-      </w:r>
-      <w:r>
-        <w:rPr>
-          <w:rFonts w:hint="eastAsia"/>
-        </w:rPr>
-        <w:t>约束的</w:t>
-      </w:r>
-      <w:r>
-        <w:rPr>
-          <w:rFonts w:hint="eastAsia"/>
-        </w:rPr>
-        <w:t xml:space="preserve"> Decision</w:t>
-      </w:r>
-      <w:r>
-        <w:rPr>
-          <w:rFonts w:hint="eastAsia"/>
-        </w:rPr>
-        <w:t>，必须经过专家路由、精确目标匹配和白名单执行；模型不可用时自动降级为规则策略。</w:t>
+        <w:t>当前正式性能结论仍限定在 CPU 竞争场景。四类 eBPF 程序已真实加载、挂载、更新策略 map、采集统计并参与回滚；网络与安全扩展当前采用受控策略和审计语义，不宣称等同于生产级防火墙或强制访问控制系统。Redis 已完成 5 次正式重复实验，采用固定工作量、阶段顺序轮换和 Student-t 95% 置信区间。</w:t>
       </w:r>
     </w:p>
     <w:p>
@@ -7932,7 +7812,7 @@
               <w:rPr>
                 <w:sz w:val="19"/>
               </w:rPr>
-              <w:t>Act / Scx Skills</w:t>
+              <w:t>Act / Scx / eBPF Skills</w:t>
             </w:r>
           </w:p>
         </w:tc>
@@ -7970,31 +7850,7 @@
               <w:rPr>
                 <w:sz w:val="19"/>
               </w:rPr>
-              <w:t>cgroup v2</w:t>
-            </w:r>
-            <w:r>
-              <w:rPr>
-                <w:sz w:val="19"/>
-              </w:rPr>
-              <w:t>、</w:t>
-            </w:r>
-            <w:r>
-              <w:rPr>
-                <w:sz w:val="19"/>
-              </w:rPr>
-              <w:t>scx daemon</w:t>
-            </w:r>
-            <w:r>
-              <w:rPr>
-                <w:sz w:val="19"/>
-              </w:rPr>
-              <w:t>、</w:t>
-            </w:r>
-            <w:r>
-              <w:rPr>
-                <w:sz w:val="19"/>
-              </w:rPr>
-              <w:t>BPF maps</w:t>
+              <w:t>cgroup v2、scx daemon、四类 BPF hook 与 maps</w:t>
             </w:r>
           </w:p>
         </w:tc>
@@ -8053,43 +7909,7 @@
               <w:rPr>
                 <w:sz w:val="19"/>
               </w:rPr>
-              <w:t>RPS</w:t>
-            </w:r>
-            <w:r>
-              <w:rPr>
-                <w:sz w:val="19"/>
-              </w:rPr>
-              <w:t>、</w:t>
-            </w:r>
-            <w:r>
-              <w:rPr>
-                <w:sz w:val="19"/>
-              </w:rPr>
-              <w:t>P99</w:t>
-            </w:r>
-            <w:r>
-              <w:rPr>
-                <w:sz w:val="19"/>
-              </w:rPr>
-              <w:t>、后台</w:t>
-            </w:r>
-            <w:r>
-              <w:rPr>
-                <w:sz w:val="19"/>
-              </w:rPr>
-              <w:t xml:space="preserve"> CPU</w:t>
-            </w:r>
-            <w:r>
-              <w:rPr>
-                <w:sz w:val="19"/>
-              </w:rPr>
-              <w:t>、</w:t>
-            </w:r>
-            <w:r>
-              <w:rPr>
-                <w:sz w:val="19"/>
-              </w:rPr>
-              <w:t>nr_rejected</w:t>
+              <w:t>RPS、P99、后台 CPU、nr_rejected、eBPF 计数</w:t>
             </w:r>
           </w:p>
         </w:tc>
@@ -8151,25 +7971,7 @@
               <w:rPr>
                 <w:sz w:val="19"/>
               </w:rPr>
-              <w:t>操作日志、</w:t>
-            </w:r>
-            <w:r>
-              <w:rPr>
-                <w:sz w:val="19"/>
-              </w:rPr>
-              <w:t xml:space="preserve">PID </w:t>
-            </w:r>
-            <w:r>
-              <w:rPr>
-                <w:sz w:val="19"/>
-              </w:rPr>
-              <w:t>迁回、</w:t>
-            </w:r>
-            <w:r>
-              <w:rPr>
-                <w:sz w:val="19"/>
-              </w:rPr>
-              <w:t>policy removal</w:t>
+              <w:t>操作日志、PID 迁回、scx/eBPF policy removal</w:t>
             </w:r>
           </w:p>
         </w:tc>
@@ -8981,100 +8783,7 @@
         <w:jc w:val="both"/>
       </w:pPr>
       <w:r>
-        <w:t xml:space="preserve">CanaryBaselineSkill </w:t>
-      </w:r>
-      <w:r>
-        <w:t>在动作前执行短时</w:t>
-      </w:r>
-      <w:r>
-        <w:t xml:space="preserve"> wrk </w:t>
-      </w:r>
-      <w:r>
-        <w:t>并记录后台</w:t>
-      </w:r>
-      <w:r>
-        <w:t xml:space="preserve"> CPU ticks</w:t>
-      </w:r>
-      <w:r>
-        <w:t>；动作后</w:t>
-      </w:r>
-      <w:r>
-        <w:t xml:space="preserve"> CanaryCandidateSkill </w:t>
-      </w:r>
-      <w:r>
-        <w:t>使用同样参数采样。</w:t>
-      </w:r>
-      <w:r>
-        <w:t xml:space="preserve">VerifySkill </w:t>
-      </w:r>
-      <w:r>
-        <w:t>同时检查</w:t>
-      </w:r>
-      <w:r>
-        <w:t xml:space="preserve"> RPS</w:t>
-      </w:r>
-      <w:r>
-        <w:t>、</w:t>
-      </w:r>
-      <w:r>
-        <w:t>P99</w:t>
-      </w:r>
-      <w:r>
-        <w:t>、后台保留率和</w:t>
-      </w:r>
-      <w:r>
-        <w:t xml:space="preserve"> sched_ext </w:t>
-      </w:r>
-      <w:r>
-        <w:t>拒绝计数。若任何硬门槛失败，</w:t>
-      </w:r>
-      <w:r>
-        <w:t xml:space="preserve">RollbackSkill </w:t>
-      </w:r>
-      <w:r>
-        <w:t>恢复</w:t>
-      </w:r>
-      <w:r>
-        <w:t xml:space="preserve"> cpu.weight</w:t>
-      </w:r>
-      <w:r>
-        <w:t>、</w:t>
-      </w:r>
-      <w:r>
-        <w:t>cpu.max</w:t>
-      </w:r>
-      <w:r>
-        <w:t>、</w:t>
-      </w:r>
-      <w:r>
-        <w:t xml:space="preserve">cpuset </w:t>
-      </w:r>
-      <w:r>
-        <w:t>和原始</w:t>
-      </w:r>
-      <w:r>
-        <w:t xml:space="preserve"> cgroup</w:t>
-      </w:r>
-      <w:r>
-        <w:t>，移除持久</w:t>
-      </w:r>
-      <w:r>
-        <w:t xml:space="preserve"> scx task policy</w:t>
-      </w:r>
-      <w:r>
-        <w:t>，并删除空</w:t>
-      </w:r>
-      <w:r>
-        <w:t xml:space="preserve"> pid cgroup </w:t>
-      </w:r>
-      <w:r>
-        <w:t>与</w:t>
-      </w:r>
-      <w:r>
-        <w:t xml:space="preserve"> base cgroup</w:t>
-      </w:r>
-      <w:r>
-        <w:t>。</w:t>
+        <w:t>CanaryBaselineSkill 在动作前执行短时 wrk 并记录后台 CPU ticks；动作后 CanaryCandidateSkill 使用同样参数采样。eBPF Skills 同步采集调度、网络、资源与安全计数。VerifySkill 检查 RPS、P99、后台保留率、sched_ext 拒绝计数和内核证据。若硬门槛失败，RollbackSkill 恢复 cgroup 参数和原始进程归属，移除持久 scx task policy，并卸载固定的 eBPF 程序。</w:t>
       </w:r>
     </w:p>
     <w:p>
@@ -9111,139 +8820,7 @@
         <w:rPr>
           <w:rFonts w:hint="eastAsia"/>
         </w:rPr>
-        <w:t>项目保留</w:t>
-      </w:r>
-      <w:r>
-        <w:rPr>
-          <w:rFonts w:hint="eastAsia"/>
-        </w:rPr>
-        <w:t xml:space="preserve"> SchedulerTraceHook</w:t>
-      </w:r>
-      <w:r>
-        <w:rPr>
-          <w:rFonts w:hint="eastAsia"/>
-        </w:rPr>
-        <w:t>、</w:t>
-      </w:r>
-      <w:r>
-        <w:rPr>
-          <w:rFonts w:hint="eastAsia"/>
-        </w:rPr>
-        <w:t>NetworkPolicyHook</w:t>
-      </w:r>
-      <w:r>
-        <w:rPr>
-          <w:rFonts w:hint="eastAsia"/>
-        </w:rPr>
-        <w:t>、</w:t>
-      </w:r>
-      <w:r>
-        <w:rPr>
-          <w:rFonts w:hint="eastAsia"/>
-        </w:rPr>
-        <w:t xml:space="preserve">SecurityPolicyHook </w:t>
-      </w:r>
-      <w:r>
-        <w:rPr>
-          <w:rFonts w:hint="eastAsia"/>
-        </w:rPr>
-        <w:t>和</w:t>
-      </w:r>
-      <w:r>
-        <w:rPr>
-          <w:rFonts w:hint="eastAsia"/>
-        </w:rPr>
-        <w:t xml:space="preserve"> ResourceControlHook</w:t>
-      </w:r>
-      <w:r>
-        <w:rPr>
-          <w:rFonts w:hint="eastAsia"/>
-        </w:rPr>
-        <w:t>。当前仓库包含调度追踪和策略</w:t>
-      </w:r>
-      <w:r>
-        <w:rPr>
-          <w:rFonts w:hint="eastAsia"/>
-        </w:rPr>
-        <w:t xml:space="preserve"> hook </w:t>
-      </w:r>
-      <w:r>
-        <w:rPr>
-          <w:rFonts w:hint="eastAsia"/>
-        </w:rPr>
-        <w:t>原型及加载框架，但正式演示不宣称</w:t>
-      </w:r>
-      <w:r>
-        <w:rPr>
-          <w:rFonts w:hint="eastAsia"/>
-        </w:rPr>
-        <w:t xml:space="preserve"> network/security Agent </w:t>
-      </w:r>
-      <w:r>
-        <w:rPr>
-          <w:rFonts w:hint="eastAsia"/>
-        </w:rPr>
-        <w:t>已完整生产化。</w:t>
-      </w:r>
-      <w:r>
-        <w:rPr>
-          <w:rFonts w:hint="eastAsia"/>
-        </w:rPr>
-        <w:t xml:space="preserve">LLMClient </w:t>
-      </w:r>
-      <w:r>
-        <w:rPr>
-          <w:rFonts w:hint="eastAsia"/>
-        </w:rPr>
-        <w:t>使用标准</w:t>
-      </w:r>
-      <w:r>
-        <w:rPr>
-          <w:rFonts w:hint="eastAsia"/>
-        </w:rPr>
-        <w:t xml:space="preserve"> HTTP </w:t>
-      </w:r>
-      <w:r>
-        <w:rPr>
-          <w:rFonts w:hint="eastAsia"/>
-        </w:rPr>
-        <w:t>接口生成结构化策略提案，正式演示采用</w:t>
-      </w:r>
-      <w:r>
-        <w:rPr>
-          <w:rFonts w:hint="eastAsia"/>
-        </w:rPr>
-        <w:t xml:space="preserve"> DeepSeek V4</w:t>
-      </w:r>
-      <w:r>
-        <w:rPr>
-          <w:rFonts w:hint="eastAsia"/>
-        </w:rPr>
-        <w:t>；提案必须通过</w:t>
-      </w:r>
-      <w:r>
-        <w:rPr>
-          <w:rFonts w:hint="eastAsia"/>
-        </w:rPr>
-        <w:t xml:space="preserve"> Schema</w:t>
-      </w:r>
-      <w:r>
-        <w:rPr>
-          <w:rFonts w:hint="eastAsia"/>
-        </w:rPr>
-        <w:t>、</w:t>
-      </w:r>
-      <w:r>
-        <w:rPr>
-          <w:rFonts w:hint="eastAsia"/>
-        </w:rPr>
-        <w:t>PolicyVerifier</w:t>
-      </w:r>
-      <w:r>
-        <w:rPr>
-          <w:rFonts w:hint="eastAsia"/>
-        </w:rPr>
-        <w:t>、专家路由和白名单执行层，模型超时或不可用时规则路由不受影响。</w:t>
+        <w:t>系统包含四类独立 BPF 程序与标准化 Skills：SchedulerTraceHook 挂载调度 tracepoint，NetworkPolicyHook 挂载 cgroup 网络入口与出口，ResourceControlHook 记录资源策略命中，SecurityPolicyHook 以 BPF LSM 提供安全审计。Agent 只写入结构化、白名单约束的 map 项，EbpfStatsSkill 把真实计数送入验证阶段，RollbackSkill 可跨进程发现并卸载固定程序。LLMClient 使用标准 HTTP 接口生成结构化策略提案；提案仍须通过 Schema、PolicyVerifier、专家路由和白名单执行层，模型不可用时自动回退本地规则。</w:t>
       </w:r>
     </w:p>
     <w:p>
@@ -9587,73 +9164,7 @@
         <w:jc w:val="both"/>
       </w:pPr>
       <w:r>
-        <w:t>测试采用功能回归、真实执行验证、性能消融和失败注入四个层次。正式性能实验在同一台</w:t>
-      </w:r>
-      <w:r>
-        <w:t xml:space="preserve"> openEuler SP4 </w:t>
-      </w:r>
-      <w:r>
-        <w:t>虚拟机上运行，每个</w:t>
-      </w:r>
-      <w:r>
-        <w:t xml:space="preserve"> phase </w:t>
-      </w:r>
-      <w:r>
-        <w:t>持续</w:t>
-      </w:r>
-      <w:r>
-        <w:t xml:space="preserve"> 20 </w:t>
-      </w:r>
-      <w:r>
-        <w:t>秒并重复</w:t>
-      </w:r>
-      <w:r>
-        <w:t xml:space="preserve"> 3 </w:t>
-      </w:r>
-      <w:r>
-        <w:t>次；所有</w:t>
-      </w:r>
-      <w:r>
-        <w:t xml:space="preserve"> phase </w:t>
-      </w:r>
-      <w:r>
-        <w:t>采用相同</w:t>
-      </w:r>
-      <w:r>
-        <w:t xml:space="preserve"> wrk/sysbench </w:t>
-      </w:r>
-      <w:r>
-        <w:t>参数。为了避免</w:t>
-      </w:r>
-      <w:r>
-        <w:t>“</w:t>
-      </w:r>
-      <w:r>
-        <w:t>牺牲后台任务换在线指标</w:t>
-      </w:r>
-      <w:r>
-        <w:t>”</w:t>
-      </w:r>
-      <w:r>
-        <w:t>，</w:t>
-      </w:r>
-      <w:r>
-        <w:t xml:space="preserve">nginx </w:t>
-      </w:r>
-      <w:r>
-        <w:t>消融只有后台</w:t>
-      </w:r>
-      <w:r>
-        <w:t xml:space="preserve"> CPU </w:t>
-      </w:r>
-      <w:r>
-        <w:t>保留率不低于</w:t>
-      </w:r>
-      <w:r>
-        <w:t xml:space="preserve"> 25% </w:t>
-      </w:r>
-      <w:r>
-        <w:t>时才允许用于性能主张。</w:t>
+        <w:t>测试采用功能回归、真实执行验证、性能消融、横向比较和失败注入五个层次。正式调度器比较在同一台 openEuler SP4 虚拟机上运行，每种方案持续 20 秒并重复 5 次；其他正式场景至少重复 3 次。所有方案使用相同的 wrk/sysbench 参数。只有后台 CPU 保留率不低于 25% 的结果才允许用于性能主张。</w:t>
       </w:r>
     </w:p>
     <w:p>
@@ -10170,37 +9681,7 @@
               <w:rPr>
                 <w:sz w:val="19"/>
               </w:rPr>
-              <w:t xml:space="preserve">20 </w:t>
-            </w:r>
-            <w:r>
-              <w:rPr>
-                <w:sz w:val="19"/>
-              </w:rPr>
-              <w:t>秒</w:t>
-            </w:r>
-            <w:r>
-              <w:rPr>
-                <w:sz w:val="19"/>
-              </w:rPr>
-              <w:t xml:space="preserve"> x 3</w:t>
-            </w:r>
-            <w:r>
-              <w:rPr>
-                <w:sz w:val="19"/>
-              </w:rPr>
-              <w:t>；</w:t>
-            </w:r>
-            <w:r>
-              <w:rPr>
-                <w:sz w:val="19"/>
-              </w:rPr>
-              <w:t xml:space="preserve">warmup 2 </w:t>
-            </w:r>
-            <w:r>
-              <w:rPr>
-                <w:sz w:val="19"/>
-              </w:rPr>
-              <w:t>秒</w:t>
+              <w:t>调度器横向对比 20 秒 x 5；其他正式场景至少 3 次</w:t>
             </w:r>
           </w:p>
         </w:tc>
@@ -10236,205 +9717,7 @@
         <w:rPr>
           <w:rFonts w:hint="eastAsia"/>
         </w:rPr>
-        <w:t xml:space="preserve">openEuler SP4 </w:t>
-      </w:r>
-      <w:r>
-        <w:rPr>
-          <w:rFonts w:hint="eastAsia"/>
-        </w:rPr>
-        <w:t>虚拟机执行</w:t>
-      </w:r>
-      <w:r>
-        <w:rPr>
-          <w:rFonts w:hint="eastAsia"/>
-        </w:rPr>
-        <w:t xml:space="preserve"> </w:t>
-      </w:r>
-      <w:r>
-        <w:rPr>
-          <w:rFonts w:hint="eastAsia"/>
-        </w:rPr>
-        <w:t xml:space="preserve">141 </w:t>
-      </w:r>
-      <w:r>
-        <w:rPr>
-          <w:rFonts w:hint="eastAsia"/>
-        </w:rPr>
-        <w:t>项</w:t>
-      </w:r>
-      <w:r>
-        <w:rPr>
-          <w:rFonts w:hint="eastAsia"/>
-        </w:rPr>
-        <w:t>自动化测试并全部通过。测试覆盖</w:t>
-      </w:r>
-      <w:r>
-        <w:rPr>
-          <w:rFonts w:hint="eastAsia"/>
-        </w:rPr>
-        <w:t xml:space="preserve"> probe</w:t>
-      </w:r>
-      <w:r>
-        <w:rPr>
-          <w:rFonts w:hint="eastAsia"/>
-        </w:rPr>
-        <w:t>、分类、</w:t>
-      </w:r>
-      <w:r>
-        <w:rPr>
-          <w:rFonts w:hint="eastAsia"/>
-        </w:rPr>
-        <w:t xml:space="preserve">LLM </w:t>
-      </w:r>
-      <w:r>
-        <w:rPr>
-          <w:rFonts w:hint="eastAsia"/>
-        </w:rPr>
-        <w:t>提案与</w:t>
-      </w:r>
-      <w:r>
-        <w:rPr>
-          <w:rFonts w:hint="eastAsia"/>
-        </w:rPr>
-        <w:t xml:space="preserve"> fallback</w:t>
-      </w:r>
-      <w:r>
-        <w:rPr>
-          <w:rFonts w:hint="eastAsia"/>
-        </w:rPr>
-        <w:t>、专家</w:t>
-      </w:r>
-      <w:r>
-        <w:rPr>
-          <w:rFonts w:hint="eastAsia"/>
-        </w:rPr>
-        <w:t xml:space="preserve"> Router</w:t>
-      </w:r>
-      <w:r>
-        <w:rPr>
-          <w:rFonts w:hint="eastAsia"/>
-        </w:rPr>
-        <w:t>、</w:t>
-      </w:r>
-      <w:r>
-        <w:rPr>
-          <w:rFonts w:hint="eastAsia"/>
-        </w:rPr>
-        <w:t>target matcher</w:t>
-      </w:r>
-      <w:r>
-        <w:rPr>
-          <w:rFonts w:hint="eastAsia"/>
-        </w:rPr>
-        <w:t>、</w:t>
-      </w:r>
-      <w:r>
-        <w:rPr>
-          <w:rFonts w:hint="eastAsia"/>
-        </w:rPr>
-        <w:t>dry-run</w:t>
-      </w:r>
-      <w:r>
-        <w:rPr>
-          <w:rFonts w:hint="eastAsia"/>
-        </w:rPr>
-        <w:t>、真实</w:t>
-      </w:r>
-      <w:r>
-        <w:rPr>
-          <w:rFonts w:hint="eastAsia"/>
-        </w:rPr>
-        <w:t xml:space="preserve"> cgroup </w:t>
-      </w:r>
-      <w:r>
-        <w:rPr>
-          <w:rFonts w:hint="eastAsia"/>
-        </w:rPr>
-        <w:t>调用、</w:t>
-      </w:r>
-      <w:r>
-        <w:rPr>
-          <w:rFonts w:hint="eastAsia"/>
-        </w:rPr>
-        <w:t xml:space="preserve">rollback </w:t>
-      </w:r>
-      <w:r>
-        <w:rPr>
-          <w:rFonts w:hint="eastAsia"/>
-        </w:rPr>
-        <w:t>清理、</w:t>
-      </w:r>
-      <w:r>
-        <w:rPr>
-          <w:rFonts w:hint="eastAsia"/>
-        </w:rPr>
-        <w:t>scx daemon</w:t>
-      </w:r>
-      <w:r>
-        <w:rPr>
-          <w:rFonts w:hint="eastAsia"/>
-        </w:rPr>
-        <w:t>、</w:t>
-      </w:r>
-      <w:r>
-        <w:rPr>
-          <w:rFonts w:hint="eastAsia"/>
-        </w:rPr>
-        <w:t>policy verifier</w:t>
-      </w:r>
-      <w:r>
-        <w:rPr>
-          <w:rFonts w:hint="eastAsia"/>
-        </w:rPr>
-        <w:t>、</w:t>
-      </w:r>
-      <w:r>
-        <w:rPr>
-          <w:rFonts w:hint="eastAsia"/>
-        </w:rPr>
-        <w:t>Canary</w:t>
-      </w:r>
-      <w:r>
-        <w:rPr>
-          <w:rFonts w:hint="eastAsia"/>
-        </w:rPr>
-        <w:t>、</w:t>
-      </w:r>
-      <w:r>
-        <w:rPr>
-          <w:rFonts w:hint="eastAsia"/>
-        </w:rPr>
-        <w:t>benchmark parser</w:t>
-      </w:r>
-      <w:r>
-        <w:rPr>
-          <w:rFonts w:hint="eastAsia"/>
-        </w:rPr>
-        <w:t>、</w:t>
-      </w:r>
-      <w:r>
-        <w:rPr>
-          <w:rFonts w:hint="eastAsia"/>
-        </w:rPr>
-        <w:t>summary</w:t>
-      </w:r>
-      <w:r>
-        <w:rPr>
-          <w:rFonts w:hint="eastAsia"/>
-        </w:rPr>
-        <w:t>、一键</w:t>
-      </w:r>
-      <w:r>
-        <w:rPr>
-          <w:rFonts w:hint="eastAsia"/>
-        </w:rPr>
-        <w:t xml:space="preserve"> Agent trace </w:t>
-      </w:r>
-      <w:r>
-        <w:rPr>
-          <w:rFonts w:hint="eastAsia"/>
-        </w:rPr>
-        <w:t>和报告生成。</w:t>
+        <w:t>openEuler SP4 虚拟机执行 167 项自动化测试并全部通过，其中包含 Linux-only 的 sched_ext 与 eBPF 加载、挂载、map 更新、统计和跨进程清理测试。其余测试覆盖 probe、分类、LLM fallback、专家 Router、target matcher、dry-run、真实 cgroup、rollback、scx daemon、Canary、benchmark parser、summary、Agent trace 和报告生成。</w:t>
       </w:r>
     </w:p>
     <w:p>
@@ -11010,6 +10293,47 @@
           </w:p>
         </w:tc>
       </w:tr>
+      <w:tr>
+        <w:trPr>
+          <w:jc w:val="center"/>
+        </w:trPr>
+        <w:tc>
+          <w:tcPr>
+            <w:tcW w:w="2880" w:type="dxa"/>
+            <w:vAlign w:val="center"/>
+          </w:tcPr>
+          <w:p>
+            <w:pPr>
+              <w:ind w:firstLineChars="0" w:firstLine="0"/>
+              <w:jc w:val="center"/>
+            </w:pPr>
+            <w:r>
+              <w:rPr>
+                <w:sz w:val="19"/>
+              </w:rPr>
+              <w:t>真实 eBPF 闭环</w:t>
+            </w:r>
+          </w:p>
+        </w:tc>
+        <w:tc>
+          <w:tcPr>
+            <w:tcW w:w="6480" w:type="dxa"/>
+            <w:vAlign w:val="center"/>
+          </w:tcPr>
+          <w:p>
+            <w:pPr>
+              <w:ind w:firstLineChars="0" w:firstLine="0"/>
+              <w:jc w:val="center"/>
+            </w:pPr>
+            <w:r>
+              <w:rPr>
+                <w:sz w:val="19"/>
+              </w:rPr>
+              <w:t>四类 hook 挂载、map 下发、统计采集与跨进程卸载</w:t>
+            </w:r>
+          </w:p>
+        </w:tc>
+      </w:tr>
     </w:tbl>
     <w:p>
       <w:pPr>
@@ -11021,19 +10345,10 @@
         <w:pStyle w:val="2"/>
       </w:pPr>
       <w:bookmarkStart w:id="22" w:name="_Toc235401076"/>
-      <w:r>
-        <w:t>4.3</w:t>
-      </w:r>
-      <w:r>
-        <w:t xml:space="preserve"> </w:t>
-      </w:r>
-      <w:r>
-        <w:t xml:space="preserve"> nginx </w:t>
-      </w:r>
-      <w:r>
-        <w:t>四组消融</w:t>
-      </w:r>
       <w:bookmarkEnd w:id="22"/>
+      <w:r>
+        <w:t>4.3  native sched_ext 调度器横向对比</w:t>
+      </w:r>
     </w:p>
     <w:p>
       <w:pPr>
@@ -11045,19 +10360,7 @@
         <w:rPr>
           <w:sz w:val="20"/>
         </w:rPr>
-        <w:t>表</w:t>
-      </w:r>
-      <w:r>
-        <w:rPr>
-          <w:sz w:val="20"/>
-        </w:rPr>
-        <w:t xml:space="preserve"> 7 nginx </w:t>
-      </w:r>
-      <w:r>
-        <w:rPr>
-          <w:sz w:val="20"/>
-        </w:rPr>
-        <w:t>四组消融结果</w:t>
+        <w:t>表 7 五种调度方案正式对比结果</w:t>
       </w:r>
     </w:p>
     <w:tbl>
@@ -11107,7 +10410,7 @@
                 <w:color w:val="FFFFFF"/>
                 <w:sz w:val="20"/>
               </w:rPr>
-              <w:t>Phase</w:t>
+              <w:t>Scheduler</w:t>
             </w:r>
           </w:p>
         </w:tc>
@@ -11195,7 +10498,7 @@
                 <w:color w:val="FFFFFF"/>
                 <w:sz w:val="20"/>
               </w:rPr>
-              <w:t>P99 降低</w:t>
+              <w:t>P99 改善</w:t>
             </w:r>
           </w:p>
         </w:tc>
@@ -11280,7 +10583,7 @@
               <w:rPr>
                 <w:sz w:val="19"/>
               </w:rPr>
-              <w:t>56,446.79</w:t>
+              <w:t>63,804.61</w:t>
             </w:r>
           </w:p>
         </w:tc>
@@ -11298,7 +10601,7 @@
               <w:rPr>
                 <w:sz w:val="19"/>
               </w:rPr>
-              <w:t>6.60</w:t>
+              <w:t>7.49</w:t>
             </w:r>
           </w:p>
         </w:tc>
@@ -11394,7 +10697,7 @@
               <w:rPr>
                 <w:sz w:val="19"/>
               </w:rPr>
-              <w:t>cgroup-only</w:t>
+              <w:t>scx_simple</w:t>
             </w:r>
           </w:p>
         </w:tc>
@@ -11413,7 +10716,7 @@
               <w:rPr>
                 <w:sz w:val="19"/>
               </w:rPr>
-              <w:t>94,335.71</w:t>
+              <w:t>86,021.22</w:t>
             </w:r>
           </w:p>
         </w:tc>
@@ -11432,7 +10735,7 @@
               <w:rPr>
                 <w:sz w:val="19"/>
               </w:rPr>
-              <w:t>4.25</w:t>
+              <w:t>24.07</w:t>
             </w:r>
           </w:p>
         </w:tc>
@@ -11451,7 +10754,7 @@
               <w:rPr>
                 <w:sz w:val="19"/>
               </w:rPr>
-              <w:t>67.12%</w:t>
+              <w:t>+34.82%</w:t>
             </w:r>
           </w:p>
         </w:tc>
@@ -11470,7 +10773,7 @@
               <w:rPr>
                 <w:sz w:val="19"/>
               </w:rPr>
-              <w:t>35.62%</w:t>
+              <w:t>-221.25%</w:t>
             </w:r>
           </w:p>
         </w:tc>
@@ -11489,7 +10792,7 @@
               <w:rPr>
                 <w:sz w:val="19"/>
               </w:rPr>
-              <w:t>47.32%</w:t>
+              <w:t>70.61%</w:t>
             </w:r>
           </w:p>
         </w:tc>
@@ -11531,7 +10834,7 @@
               <w:rPr>
                 <w:sz w:val="19"/>
               </w:rPr>
-              <w:t>scx-only</w:t>
+              <w:t>scx_qmap</w:t>
             </w:r>
           </w:p>
         </w:tc>
@@ -11549,7 +10852,7 @@
               <w:rPr>
                 <w:sz w:val="19"/>
               </w:rPr>
-              <w:t>99,401.92</w:t>
+              <w:t>5,476.45</w:t>
             </w:r>
           </w:p>
         </w:tc>
@@ -11567,7 +10870,7 @@
               <w:rPr>
                 <w:sz w:val="19"/>
               </w:rPr>
-              <w:t>2.39</w:t>
+              <w:t>21.34</w:t>
             </w:r>
           </w:p>
         </w:tc>
@@ -11585,7 +10888,7 @@
               <w:rPr>
                 <w:sz w:val="19"/>
               </w:rPr>
-              <w:t>76.10%</w:t>
+              <w:t>-91.42%</w:t>
             </w:r>
           </w:p>
         </w:tc>
@@ -11603,7 +10906,7 @@
               <w:rPr>
                 <w:sz w:val="19"/>
               </w:rPr>
-              <w:t>63.72%</w:t>
+              <w:t>-184.81%</w:t>
             </w:r>
           </w:p>
         </w:tc>
@@ -11621,7 +10924,7 @@
               <w:rPr>
                 <w:sz w:val="19"/>
               </w:rPr>
-              <w:t>46.04%</w:t>
+              <w:t>179.56%</w:t>
             </w:r>
           </w:p>
         </w:tc>
@@ -11663,7 +10966,7 @@
               <w:rPr>
                 <w:sz w:val="19"/>
               </w:rPr>
-              <w:t>agent-combined</w:t>
+              <w:t>scx_flatcg</w:t>
             </w:r>
           </w:p>
         </w:tc>
@@ -11682,7 +10985,7 @@
               <w:rPr>
                 <w:sz w:val="19"/>
               </w:rPr>
-              <w:t>97,397.92</w:t>
+              <w:t>86,154.63</w:t>
             </w:r>
           </w:p>
         </w:tc>
@@ -11701,7 +11004,7 @@
               <w:rPr>
                 <w:sz w:val="19"/>
               </w:rPr>
-              <w:t>2.24</w:t>
+              <w:t>23.84</w:t>
             </w:r>
           </w:p>
         </w:tc>
@@ -11720,7 +11023,7 @@
               <w:rPr>
                 <w:sz w:val="19"/>
               </w:rPr>
-              <w:t>72.55%</w:t>
+              <w:t>+35.03%</w:t>
             </w:r>
           </w:p>
         </w:tc>
@@ -11739,7 +11042,7 @@
               <w:rPr>
                 <w:sz w:val="19"/>
               </w:rPr>
-              <w:t>66.04%</w:t>
+              <w:t>-218.18%</w:t>
             </w:r>
           </w:p>
         </w:tc>
@@ -11758,7 +11061,7 @@
               <w:rPr>
                 <w:sz w:val="19"/>
               </w:rPr>
-              <w:t>47.03%</w:t>
+              <w:t>70.32%</w:t>
             </w:r>
           </w:p>
         </w:tc>
@@ -11782,105 +11085,149 @@
           </w:p>
         </w:tc>
       </w:tr>
+      <w:tr>
+        <w:trPr>
+          <w:jc w:val="center"/>
+        </w:trPr>
+        <w:tc>
+          <w:tcPr>
+            <w:tcW w:w="1656" w:type="dxa"/>
+            <w:shd w:val="clear" w:color="auto" w:fill="F7FAFC"/>
+            <w:vAlign w:val="center"/>
+          </w:tcPr>
+          <w:p>
+            <w:pPr>
+              <w:ind w:firstLineChars="0" w:firstLine="0"/>
+              <w:jc w:val="center"/>
+            </w:pPr>
+            <w:r>
+              <w:rPr>
+                <w:sz w:val="19"/>
+              </w:rPr>
+              <w:t>scx_agent</w:t>
+            </w:r>
+          </w:p>
+        </w:tc>
+        <w:tc>
+          <w:tcPr>
+            <w:tcW w:w="1440" w:type="dxa"/>
+            <w:shd w:val="clear" w:color="auto" w:fill="F7FAFC"/>
+            <w:vAlign w:val="center"/>
+          </w:tcPr>
+          <w:p>
+            <w:pPr>
+              <w:ind w:firstLineChars="0" w:firstLine="0"/>
+              <w:jc w:val="center"/>
+            </w:pPr>
+            <w:r>
+              <w:rPr>
+                <w:sz w:val="19"/>
+              </w:rPr>
+              <w:t>114,224.98</w:t>
+            </w:r>
+          </w:p>
+        </w:tc>
+        <w:tc>
+          <w:tcPr>
+            <w:tcW w:w="1008" w:type="dxa"/>
+            <w:shd w:val="clear" w:color="auto" w:fill="F7FAFC"/>
+            <w:vAlign w:val="center"/>
+          </w:tcPr>
+          <w:p>
+            <w:pPr>
+              <w:ind w:firstLineChars="0" w:firstLine="0"/>
+              <w:jc w:val="center"/>
+            </w:pPr>
+            <w:r>
+              <w:rPr>
+                <w:sz w:val="19"/>
+              </w:rPr>
+              <w:t>2.99</w:t>
+            </w:r>
+          </w:p>
+        </w:tc>
+        <w:tc>
+          <w:tcPr>
+            <w:tcW w:w="1224" w:type="dxa"/>
+            <w:shd w:val="clear" w:color="auto" w:fill="F7FAFC"/>
+            <w:vAlign w:val="center"/>
+          </w:tcPr>
+          <w:p>
+            <w:pPr>
+              <w:ind w:firstLineChars="0" w:firstLine="0"/>
+              <w:jc w:val="center"/>
+            </w:pPr>
+            <w:r>
+              <w:rPr>
+                <w:sz w:val="19"/>
+              </w:rPr>
+              <w:t>+79.02%</w:t>
+            </w:r>
+          </w:p>
+        </w:tc>
+        <w:tc>
+          <w:tcPr>
+            <w:tcW w:w="1224" w:type="dxa"/>
+            <w:shd w:val="clear" w:color="auto" w:fill="F7FAFC"/>
+            <w:vAlign w:val="center"/>
+          </w:tcPr>
+          <w:p>
+            <w:pPr>
+              <w:ind w:firstLineChars="0" w:firstLine="0"/>
+              <w:jc w:val="center"/>
+            </w:pPr>
+            <w:r>
+              <w:rPr>
+                <w:sz w:val="19"/>
+              </w:rPr>
+              <w:t>+60.04%</w:t>
+            </w:r>
+          </w:p>
+        </w:tc>
+        <w:tc>
+          <w:tcPr>
+            <w:tcW w:w="1440" w:type="dxa"/>
+            <w:shd w:val="clear" w:color="auto" w:fill="F7FAFC"/>
+            <w:vAlign w:val="center"/>
+          </w:tcPr>
+          <w:p>
+            <w:pPr>
+              <w:ind w:firstLineChars="0" w:firstLine="0"/>
+              <w:jc w:val="center"/>
+            </w:pPr>
+            <w:r>
+              <w:rPr>
+                <w:sz w:val="19"/>
+              </w:rPr>
+              <w:t>30.48%</w:t>
+            </w:r>
+          </w:p>
+        </w:tc>
+        <w:tc>
+          <w:tcPr>
+            <w:tcW w:w="792" w:type="dxa"/>
+            <w:shd w:val="clear" w:color="auto" w:fill="F7FAFC"/>
+            <w:vAlign w:val="center"/>
+          </w:tcPr>
+          <w:p>
+            <w:pPr>
+              <w:ind w:firstLineChars="0" w:firstLine="0"/>
+              <w:jc w:val="center"/>
+            </w:pPr>
+            <w:r>
+              <w:rPr>
+                <w:sz w:val="19"/>
+              </w:rPr>
+              <w:t>是</w:t>
+            </w:r>
+          </w:p>
+        </w:tc>
+      </w:tr>
     </w:tbl>
     <w:p>
       <w:pPr>
         <w:ind w:firstLine="480"/>
       </w:pPr>
-    </w:p>
-    <w:p>
-      <w:pPr>
-        <w:keepNext/>
-        <w:spacing w:before="120" w:after="60" w:line="240" w:lineRule="auto"/>
-        <w:ind w:firstLine="480"/>
-        <w:jc w:val="center"/>
-      </w:pPr>
-      <w:r>
-        <w:rPr>
-          <w:noProof/>
-        </w:rPr>
-        <w:drawing>
-          <wp:inline distT="0" distB="0" distL="0" distR="0" wp14:anchorId="3013D920" wp14:editId="310C7F96">
-            <wp:extent cx="4664348" cy="2623820"/>
-            <wp:effectExtent l="0" t="0" r="3175" b="5080"/>
-            <wp:docPr id="7" name="图形 7" descr="Updated formal four-way nginx ablation with throughput, P99 and background retention, 20 seconds by 3 repeats."/>
-            <wp:cNvGraphicFramePr>
-              <a:graphicFrameLocks xmlns:a="http://schemas.openxmlformats.org/drawingml/2006/main" noChangeAspect="1"/>
-            </wp:cNvGraphicFramePr>
-            <a:graphic xmlns:a="http://schemas.openxmlformats.org/drawingml/2006/main">
-              <a:graphicData uri="http://schemas.openxmlformats.org/drawingml/2006/picture">
-                <pic:pic xmlns:pic="http://schemas.openxmlformats.org/drawingml/2006/picture">
-                  <pic:nvPicPr>
-                    <pic:cNvPr id="7" name=""/>
-                    <pic:cNvPicPr/>
-                  </pic:nvPicPr>
-                  <pic:blipFill>
-                    <a:blip r:embed="rId20" cstate="print">
-                      <a:extLst>
-                        <a:ext uri="{28A0092B-C50C-407E-A947-70E740481C1C}">
-                          <a14:useLocalDpi xmlns:a14="http://schemas.microsoft.com/office/drawing/2010/main" val="0"/>
-                        </a:ext>
-                        <a:ext uri="{96DAC541-7B7A-43D3-8B79-37D633B846F1}">
-                          <asvg:svgBlip xmlns:asvg="http://schemas.microsoft.com/office/drawing/2016/SVG/main" r:embed="rId21"/>
-                        </a:ext>
-                      </a:extLst>
-                    </a:blip>
-                    <a:stretch>
-                      <a:fillRect/>
-                    </a:stretch>
-                  </pic:blipFill>
-                  <pic:spPr>
-                    <a:xfrm>
-                      <a:off x="0" y="0"/>
-                      <a:ext cx="4664348" cy="2623820"/>
-                    </a:xfrm>
-                    <a:prstGeom prst="rect">
-                      <a:avLst/>
-                    </a:prstGeom>
-                  </pic:spPr>
-                </pic:pic>
-              </a:graphicData>
-            </a:graphic>
-          </wp:inline>
-        </w:drawing>
-      </w:r>
-    </w:p>
-    <w:p>
-      <w:pPr>
-        <w:keepNext/>
-        <w:ind w:firstLine="400"/>
-        <w:jc w:val="center"/>
-      </w:pPr>
-      <w:r>
-        <w:rPr>
-          <w:sz w:val="20"/>
-        </w:rPr>
-        <w:t>图</w:t>
-      </w:r>
-      <w:r>
-        <w:rPr>
-          <w:sz w:val="20"/>
-        </w:rPr>
-        <w:t xml:space="preserve"> 4 nginx </w:t>
-      </w:r>
-      <w:r>
-        <w:rPr>
-          <w:sz w:val="20"/>
-        </w:rPr>
-        <w:t>四组消融：吞吐与</w:t>
-      </w:r>
-      <w:r>
-        <w:rPr>
-          <w:sz w:val="20"/>
-        </w:rPr>
-        <w:t xml:space="preserve"> P99 </w:t>
-      </w:r>
-      <w:r>
-        <w:rPr>
-          <w:sz w:val="20"/>
-        </w:rPr>
-        <w:t>延迟</w:t>
-      </w:r>
     </w:p>
     <w:p>
       <w:pPr>
@@ -11891,223 +11238,7 @@
         <w:rPr>
           <w:rFonts w:hint="eastAsia"/>
         </w:rPr>
-        <w:t>结果表明，</w:t>
-      </w:r>
-      <w:r>
-        <w:rPr>
-          <w:rFonts w:hint="eastAsia"/>
-        </w:rPr>
-        <w:t xml:space="preserve">CPU </w:t>
-      </w:r>
-      <w:r>
-        <w:rPr>
-          <w:rFonts w:hint="eastAsia"/>
-        </w:rPr>
-        <w:t>干扰下</w:t>
-      </w:r>
-      <w:r>
-        <w:rPr>
-          <w:rFonts w:hint="eastAsia"/>
-        </w:rPr>
-        <w:t xml:space="preserve"> cgroup </w:t>
-      </w:r>
-      <w:r>
-        <w:rPr>
-          <w:rFonts w:hint="eastAsia"/>
-        </w:rPr>
-        <w:t>与</w:t>
-      </w:r>
-      <w:r>
-        <w:rPr>
-          <w:rFonts w:hint="eastAsia"/>
-        </w:rPr>
-        <w:t xml:space="preserve"> scx </w:t>
-      </w:r>
-      <w:r>
-        <w:rPr>
-          <w:rFonts w:hint="eastAsia"/>
-        </w:rPr>
-        <w:t>均能改善在线服务；</w:t>
-      </w:r>
-      <w:r>
-        <w:rPr>
-          <w:rFonts w:hint="eastAsia"/>
-        </w:rPr>
-        <w:t xml:space="preserve">scx-only </w:t>
-      </w:r>
-      <w:r>
-        <w:rPr>
-          <w:rFonts w:hint="eastAsia"/>
-        </w:rPr>
-        <w:t>获得最高平均</w:t>
-      </w:r>
-      <w:r>
-        <w:rPr>
-          <w:rFonts w:hint="eastAsia"/>
-        </w:rPr>
-        <w:t xml:space="preserve"> RPS</w:t>
-      </w:r>
-      <w:r>
-        <w:rPr>
-          <w:rFonts w:hint="eastAsia"/>
-        </w:rPr>
-        <w:t>，</w:t>
-      </w:r>
-      <w:r>
-        <w:rPr>
-          <w:rFonts w:hint="eastAsia"/>
-        </w:rPr>
-        <w:t xml:space="preserve">Agent </w:t>
-      </w:r>
-      <w:r>
-        <w:rPr>
-          <w:rFonts w:hint="eastAsia"/>
-        </w:rPr>
-        <w:t>联合策略获得最低平均</w:t>
-      </w:r>
-      <w:r>
-        <w:rPr>
-          <w:rFonts w:hint="eastAsia"/>
-        </w:rPr>
-        <w:t xml:space="preserve"> P99</w:t>
-      </w:r>
-      <w:r>
-        <w:rPr>
-          <w:rFonts w:hint="eastAsia"/>
-        </w:rPr>
-        <w:t>。</w:t>
-      </w:r>
-      <w:r>
-        <w:rPr>
-          <w:rFonts w:hint="eastAsia"/>
-        </w:rPr>
-        <w:t xml:space="preserve">agent-combined </w:t>
-      </w:r>
-      <w:r>
-        <w:rPr>
-          <w:rFonts w:hint="eastAsia"/>
-        </w:rPr>
-        <w:t>相对</w:t>
-      </w:r>
-      <w:r>
-        <w:rPr>
-          <w:rFonts w:hint="eastAsia"/>
-        </w:rPr>
-        <w:t xml:space="preserve"> default </w:t>
-      </w:r>
-      <w:r>
-        <w:rPr>
-          <w:rFonts w:hint="eastAsia"/>
-        </w:rPr>
-        <w:t>的</w:t>
-      </w:r>
-      <w:r>
-        <w:rPr>
-          <w:rFonts w:hint="eastAsia"/>
-        </w:rPr>
-        <w:t xml:space="preserve"> RPS </w:t>
-      </w:r>
-      <w:r>
-        <w:rPr>
-          <w:rFonts w:hint="eastAsia"/>
-        </w:rPr>
-        <w:t>提升</w:t>
-      </w:r>
-      <w:r>
-        <w:rPr>
-          <w:rFonts w:hint="eastAsia"/>
-        </w:rPr>
-        <w:t xml:space="preserve"> 72.55%</w:t>
-      </w:r>
-      <w:r>
-        <w:rPr>
-          <w:rFonts w:hint="eastAsia"/>
-        </w:rPr>
-        <w:t>，</w:t>
-      </w:r>
-      <w:r>
-        <w:rPr>
-          <w:rFonts w:hint="eastAsia"/>
-        </w:rPr>
-        <w:t xml:space="preserve">P99 </w:t>
-      </w:r>
-      <w:r>
-        <w:rPr>
-          <w:rFonts w:hint="eastAsia"/>
-        </w:rPr>
-        <w:t>降低</w:t>
-      </w:r>
-      <w:r>
-        <w:rPr>
-          <w:rFonts w:hint="eastAsia"/>
-        </w:rPr>
-        <w:t xml:space="preserve"> 66.04%</w:t>
-      </w:r>
-      <w:r>
-        <w:rPr>
-          <w:rFonts w:hint="eastAsia"/>
-        </w:rPr>
-        <w:t>，同时后台</w:t>
-      </w:r>
-      <w:r>
-        <w:rPr>
-          <w:rFonts w:hint="eastAsia"/>
-        </w:rPr>
-        <w:t xml:space="preserve"> CPU </w:t>
-      </w:r>
-      <w:r>
-        <w:rPr>
-          <w:rFonts w:hint="eastAsia"/>
-        </w:rPr>
-        <w:t>保留率为</w:t>
-      </w:r>
-      <w:r>
-        <w:rPr>
-          <w:rFonts w:hint="eastAsia"/>
-        </w:rPr>
-        <w:t xml:space="preserve"> 47.03%</w:t>
-      </w:r>
-      <w:r>
-        <w:rPr>
-          <w:rFonts w:hint="eastAsia"/>
-        </w:rPr>
-        <w:t>，高于</w:t>
-      </w:r>
-      <w:r>
-        <w:rPr>
-          <w:rFonts w:hint="eastAsia"/>
-        </w:rPr>
-        <w:t xml:space="preserve"> 25% </w:t>
-      </w:r>
-      <w:r>
-        <w:rPr>
-          <w:rFonts w:hint="eastAsia"/>
-        </w:rPr>
-        <w:t>有效门槛。四组消融使用固定参数分离执行后端贡献；</w:t>
-      </w:r>
-      <w:r>
-        <w:rPr>
-          <w:rFonts w:hint="eastAsia"/>
-        </w:rPr>
-        <w:t xml:space="preserve">DeepSeek </w:t>
-      </w:r>
-      <w:r>
-        <w:rPr>
-          <w:rFonts w:hint="eastAsia"/>
-        </w:rPr>
-        <w:t>决策能力由独立的正式</w:t>
-      </w:r>
-      <w:r>
-        <w:rPr>
-          <w:rFonts w:hint="eastAsia"/>
-        </w:rPr>
-        <w:t xml:space="preserve"> Canary Agent trace </w:t>
-      </w:r>
-      <w:r>
-        <w:rPr>
-          <w:rFonts w:hint="eastAsia"/>
-        </w:rPr>
-        <w:t>验证。</w:t>
+        <w:t>五次重复实验表明，自研 scx_agent 相对默认调度器的平均 RPS 提升 79.02%，平均 P99 降低 60.04%，后台 CPU 保留率为 30.48%，超过 25% 公平性门槛。scx_simple 与 scx_flatcg 提升吞吐但尾延迟明显恶化，scx_qmap 在本场景中偏向后台计算。结果说明比赛价值不只是加载任意 scx，而是由 Agent 感知 workload 并把任务级分类和权重送入自研调度器。</w:t>
       </w:r>
     </w:p>
     <w:p>
@@ -12840,6 +11971,12 @@
         </w:rPr>
         <w:t>目标切换到批处理吞吐专家。</w:t>
       </w:r>
+      <w:r>
+        <w:rPr>
+          <w:rFonts w:hint="eastAsia"/>
+        </w:rPr>
+        <w:t>Redis 场景中，CPU 干扰使 QPS 下降 34.38%，Agent 相比干扰组恢复 31.03% QPS、降低 38.75% P99，并保持 61.25% 后台进度。</w:t>
+      </w:r>
     </w:p>
     <w:p>
       <w:pPr>
@@ -13667,115 +12804,7 @@
         <w:rPr>
           <w:rFonts w:hint="eastAsia"/>
         </w:rPr>
-        <w:t>正式结果保存在</w:t>
-      </w:r>
-      <w:r>
-        <w:rPr>
-          <w:rFonts w:hint="eastAsia"/>
-        </w:rPr>
-        <w:t xml:space="preserve"> results/competition-agent-llm/2026-07-17_07-50-10/</w:t>
-      </w:r>
-      <w:r>
-        <w:rPr>
-          <w:rFonts w:hint="eastAsia"/>
-        </w:rPr>
-        <w:t>，共包含环境、每次</w:t>
-      </w:r>
-      <w:r>
-        <w:rPr>
-          <w:rFonts w:hint="eastAsia"/>
-        </w:rPr>
-        <w:t xml:space="preserve"> wrk/sysbench </w:t>
-      </w:r>
-      <w:r>
-        <w:rPr>
-          <w:rFonts w:hint="eastAsia"/>
-        </w:rPr>
-        <w:t>原始输出、</w:t>
-      </w:r>
-      <w:r>
-        <w:rPr>
-          <w:rFonts w:hint="eastAsia"/>
-        </w:rPr>
-        <w:t xml:space="preserve">DeepSeek </w:t>
-      </w:r>
-      <w:r>
-        <w:rPr>
-          <w:rFonts w:hint="eastAsia"/>
-        </w:rPr>
-        <w:t>提案、专家路由得分、</w:t>
-      </w:r>
-      <w:r>
-        <w:rPr>
-          <w:rFonts w:hint="eastAsia"/>
-        </w:rPr>
-        <w:t xml:space="preserve">Action/cgroup/scx </w:t>
-      </w:r>
-      <w:r>
-        <w:rPr>
-          <w:rFonts w:hint="eastAsia"/>
-        </w:rPr>
-        <w:t>证据、</w:t>
-      </w:r>
-      <w:r>
-        <w:rPr>
-          <w:rFonts w:hint="eastAsia"/>
-        </w:rPr>
-        <w:t>agent-trace.json</w:t>
-      </w:r>
-      <w:r>
-        <w:rPr>
-          <w:rFonts w:hint="eastAsia"/>
-        </w:rPr>
-        <w:t>、</w:t>
-      </w:r>
-      <w:r>
-        <w:rPr>
-          <w:rFonts w:hint="eastAsia"/>
-        </w:rPr>
-        <w:t>Canary</w:t>
-      </w:r>
-      <w:r>
-        <w:rPr>
-          <w:rFonts w:hint="eastAsia"/>
-        </w:rPr>
-        <w:t>、</w:t>
-      </w:r>
-      <w:r>
-        <w:rPr>
-          <w:rFonts w:hint="eastAsia"/>
-        </w:rPr>
-        <w:t>rollback</w:t>
-      </w:r>
-      <w:r>
-        <w:rPr>
-          <w:rFonts w:hint="eastAsia"/>
-        </w:rPr>
-        <w:t>、</w:t>
-      </w:r>
-      <w:r>
-        <w:rPr>
-          <w:rFonts w:hint="eastAsia"/>
-        </w:rPr>
-        <w:t xml:space="preserve">CSV/JSON summary </w:t>
-      </w:r>
-      <w:r>
-        <w:rPr>
-          <w:rFonts w:hint="eastAsia"/>
-        </w:rPr>
-        <w:t>和自动报告。报告不修改负向结果；解析不到的指标留空并保留</w:t>
-      </w:r>
-      <w:r>
-        <w:rPr>
-          <w:rFonts w:hint="eastAsia"/>
-        </w:rPr>
-        <w:t xml:space="preserve"> raw output</w:t>
-      </w:r>
-      <w:r>
-        <w:rPr>
-          <w:rFonts w:hint="eastAsia"/>
-        </w:rPr>
-        <w:t>。</w:t>
+        <w:t>正式证据包括 results/competition-agent-llm/ 下的一键闭环，以及 results/scx-compare-formal/2026-08-29_20-14-31/ 下的五次调度器横向实验。目录保留每次 wrk/sysbench 原始输出、DeepSeek 提案、专家路由得分、Action/cgroup/scx/eBPF 证据、scheduler log、CSV/JSON summary 和自动报告；解析不到的指标留空，不修改负向结果。</w:t>
       </w:r>
     </w:p>
     <w:p>
@@ -14770,139 +13799,7 @@
         <w:rPr>
           <w:rFonts w:hint="eastAsia"/>
         </w:rPr>
-        <w:t xml:space="preserve">SchedX-Agent </w:t>
-      </w:r>
-      <w:r>
-        <w:rPr>
-          <w:rFonts w:hint="eastAsia"/>
-        </w:rPr>
-        <w:t>已在</w:t>
-      </w:r>
-      <w:r>
-        <w:rPr>
-          <w:rFonts w:hint="eastAsia"/>
-        </w:rPr>
-        <w:t xml:space="preserve"> openEuler 24.03 LTS SP4 </w:t>
-      </w:r>
-      <w:r>
-        <w:rPr>
-          <w:rFonts w:hint="eastAsia"/>
-        </w:rPr>
-        <w:t>上完成从</w:t>
-      </w:r>
-      <w:r>
-        <w:rPr>
-          <w:rFonts w:hint="eastAsia"/>
-        </w:rPr>
-        <w:t xml:space="preserve"> workload </w:t>
-      </w:r>
-      <w:r>
-        <w:rPr>
-          <w:rFonts w:hint="eastAsia"/>
-        </w:rPr>
-        <w:t>感知、</w:t>
-      </w:r>
-      <w:r>
-        <w:rPr>
-          <w:rFonts w:hint="eastAsia"/>
-        </w:rPr>
-        <w:t xml:space="preserve">DeepSeek </w:t>
-      </w:r>
-      <w:r>
-        <w:rPr>
-          <w:rFonts w:hint="eastAsia"/>
-        </w:rPr>
-        <w:t>结构化提案、学习型专家路由、</w:t>
-      </w:r>
-      <w:r>
-        <w:rPr>
-          <w:rFonts w:hint="eastAsia"/>
-        </w:rPr>
-        <w:t xml:space="preserve">native sched_ext/cgroup </w:t>
-      </w:r>
-      <w:r>
-        <w:rPr>
-          <w:rFonts w:hint="eastAsia"/>
-        </w:rPr>
-        <w:t>执行到真实</w:t>
-      </w:r>
-      <w:r>
-        <w:rPr>
-          <w:rFonts w:hint="eastAsia"/>
-        </w:rPr>
-        <w:t xml:space="preserve"> SLO </w:t>
-      </w:r>
-      <w:r>
-        <w:rPr>
-          <w:rFonts w:hint="eastAsia"/>
-        </w:rPr>
-        <w:t>验证和自动回滚的闭环。项目形成了标准化</w:t>
-      </w:r>
-      <w:r>
-        <w:rPr>
-          <w:rFonts w:hint="eastAsia"/>
-        </w:rPr>
-        <w:t xml:space="preserve"> Skills</w:t>
-      </w:r>
-      <w:r>
-        <w:rPr>
-          <w:rFonts w:hint="eastAsia"/>
-        </w:rPr>
-        <w:t>、安全动作接口、项目专用</w:t>
-      </w:r>
-      <w:r>
-        <w:rPr>
-          <w:rFonts w:hint="eastAsia"/>
-        </w:rPr>
-        <w:t xml:space="preserve"> scx_agent</w:t>
-      </w:r>
-      <w:r>
-        <w:rPr>
-          <w:rFonts w:hint="eastAsia"/>
-        </w:rPr>
-        <w:t>、持久</w:t>
-      </w:r>
-      <w:r>
-        <w:rPr>
-          <w:rFonts w:hint="eastAsia"/>
-        </w:rPr>
-        <w:t xml:space="preserve"> daemon</w:t>
-      </w:r>
-      <w:r>
-        <w:rPr>
-          <w:rFonts w:hint="eastAsia"/>
-        </w:rPr>
-        <w:t>、可复现实验和自动报告，并通过</w:t>
-      </w:r>
-      <w:r>
-        <w:rPr>
-          <w:rFonts w:hint="eastAsia"/>
-        </w:rPr>
-        <w:t xml:space="preserve"> </w:t>
-      </w:r>
-      <w:r>
-        <w:rPr>
-          <w:rFonts w:hint="eastAsia"/>
-        </w:rPr>
-        <w:t xml:space="preserve">141 </w:t>
-      </w:r>
-      <w:r>
-        <w:rPr>
-          <w:rFonts w:hint="eastAsia"/>
-        </w:rPr>
-        <w:t>项</w:t>
-      </w:r>
-      <w:r>
-        <w:rPr>
-          <w:rFonts w:hint="eastAsia"/>
-        </w:rPr>
-        <w:t xml:space="preserve"> openEuler </w:t>
-      </w:r>
-      <w:r>
-        <w:rPr>
-          <w:rFonts w:hint="eastAsia"/>
-        </w:rPr>
-        <w:t>测试。</w:t>
+        <w:t>SchedX-Agent 已在 openEuler 24.03 LTS SP4 上完成从 workload 感知、DeepSeek 结构化提案、学习型专家路由、native sched_ext/cgroup/eBPF 执行，到真实 SLO 验证和自动回滚的闭环。项目形成了标准化 Skills、安全动作接口、项目专用 scx_agent、四类真实 eBPF hook、持久 daemon、可复现实验和自动报告，并通过 167 项 openEuler 测试。</w:t>
       </w:r>
     </w:p>
     <w:p>
@@ -14914,199 +13811,13 @@
         <w:rPr>
           <w:rFonts w:hint="eastAsia"/>
         </w:rPr>
-        <w:t>正式四组消融中，</w:t>
-      </w:r>
-      <w:r>
-        <w:rPr>
-          <w:rFonts w:hint="eastAsia"/>
-        </w:rPr>
-        <w:t xml:space="preserve">Agent </w:t>
-      </w:r>
-      <w:r>
-        <w:rPr>
-          <w:rFonts w:hint="eastAsia"/>
-        </w:rPr>
-        <w:t>联合策略相对</w:t>
-      </w:r>
-      <w:r>
-        <w:rPr>
-          <w:rFonts w:hint="eastAsia"/>
-        </w:rPr>
-        <w:t xml:space="preserve"> default </w:t>
-      </w:r>
-      <w:r>
-        <w:rPr>
-          <w:rFonts w:hint="eastAsia"/>
-        </w:rPr>
-        <w:t>的</w:t>
-      </w:r>
-      <w:r>
-        <w:rPr>
-          <w:rFonts w:hint="eastAsia"/>
-        </w:rPr>
-        <w:t xml:space="preserve"> nginx RPS </w:t>
-      </w:r>
-      <w:r>
-        <w:rPr>
-          <w:rFonts w:hint="eastAsia"/>
-        </w:rPr>
-        <w:t>提升</w:t>
-      </w:r>
-      <w:r>
-        <w:rPr>
-          <w:rFonts w:hint="eastAsia"/>
-        </w:rPr>
-        <w:t xml:space="preserve"> 72.55%</w:t>
-      </w:r>
-      <w:r>
-        <w:rPr>
-          <w:rFonts w:hint="eastAsia"/>
-        </w:rPr>
-        <w:t>、</w:t>
-      </w:r>
-      <w:r>
-        <w:rPr>
-          <w:rFonts w:hint="eastAsia"/>
-        </w:rPr>
-        <w:t xml:space="preserve">P99 </w:t>
-      </w:r>
-      <w:r>
-        <w:rPr>
-          <w:rFonts w:hint="eastAsia"/>
-        </w:rPr>
-        <w:t>降低</w:t>
-      </w:r>
-      <w:r>
-        <w:rPr>
-          <w:rFonts w:hint="eastAsia"/>
-        </w:rPr>
-        <w:t xml:space="preserve"> 66.04%</w:t>
-      </w:r>
-      <w:r>
-        <w:rPr>
-          <w:rFonts w:hint="eastAsia"/>
-        </w:rPr>
-        <w:t>，后台</w:t>
-      </w:r>
-      <w:r>
-        <w:rPr>
-          <w:rFonts w:hint="eastAsia"/>
-        </w:rPr>
-        <w:t xml:space="preserve"> CPU </w:t>
-      </w:r>
-      <w:r>
-        <w:rPr>
-          <w:rFonts w:hint="eastAsia"/>
-        </w:rPr>
-        <w:t>保留率</w:t>
-      </w:r>
-      <w:r>
-        <w:rPr>
-          <w:rFonts w:hint="eastAsia"/>
-        </w:rPr>
-        <w:t xml:space="preserve"> 47.03%</w:t>
-      </w:r>
-      <w:r>
-        <w:rPr>
-          <w:rFonts w:hint="eastAsia"/>
-        </w:rPr>
-        <w:t>；</w:t>
-      </w:r>
-      <w:r>
-        <w:rPr>
-          <w:rFonts w:hint="eastAsia"/>
-        </w:rPr>
-        <w:t xml:space="preserve">sysbench </w:t>
-      </w:r>
-      <w:r>
-        <w:rPr>
-          <w:rFonts w:hint="eastAsia"/>
-        </w:rPr>
-        <w:t>在干扰下的吞吐恢复</w:t>
-      </w:r>
-      <w:r>
-        <w:rPr>
-          <w:rFonts w:hint="eastAsia"/>
-        </w:rPr>
-        <w:t xml:space="preserve"> 66.22%</w:t>
-      </w:r>
-      <w:r>
-        <w:rPr>
-          <w:rFonts w:hint="eastAsia"/>
-        </w:rPr>
-        <w:t>。正式</w:t>
-      </w:r>
-      <w:r>
-        <w:rPr>
-          <w:rFonts w:hint="eastAsia"/>
-        </w:rPr>
-        <w:t xml:space="preserve"> Agent Canary </w:t>
-      </w:r>
-      <w:r>
-        <w:rPr>
-          <w:rFonts w:hint="eastAsia"/>
-        </w:rPr>
-        <w:t>进一步记录了</w:t>
-      </w:r>
-      <w:r>
-        <w:rPr>
-          <w:rFonts w:hint="eastAsia"/>
-        </w:rPr>
-        <w:t xml:space="preserve"> deepseek-v4 </w:t>
-      </w:r>
-      <w:r>
-        <w:rPr>
-          <w:rFonts w:hint="eastAsia"/>
-        </w:rPr>
-        <w:t>→</w:t>
-      </w:r>
-      <w:r>
-        <w:rPr>
-          <w:rFonts w:hint="eastAsia"/>
-        </w:rPr>
-        <w:t xml:space="preserve"> latency_guard </w:t>
-      </w:r>
-      <w:r>
-        <w:rPr>
-          <w:rFonts w:hint="eastAsia"/>
-        </w:rPr>
-        <w:t>→</w:t>
-      </w:r>
-      <w:r>
-        <w:rPr>
-          <w:rFonts w:hint="eastAsia"/>
-        </w:rPr>
-        <w:t xml:space="preserve"> accepted/rejected </w:t>
-      </w:r>
-      <w:r>
-        <w:rPr>
-          <w:rFonts w:hint="eastAsia"/>
-        </w:rPr>
-        <w:t>的完整路径，严格</w:t>
-      </w:r>
-      <w:r>
-        <w:rPr>
-          <w:rFonts w:hint="eastAsia"/>
-        </w:rPr>
-        <w:t xml:space="preserve"> P99 </w:t>
-      </w:r>
-      <w:r>
-        <w:rPr>
-          <w:rFonts w:hint="eastAsia"/>
-        </w:rPr>
-        <w:t>门槛触发自动回滚，证明系统既能自主决策，也能拒绝不满足</w:t>
-      </w:r>
-      <w:r>
-        <w:rPr>
-          <w:rFonts w:hint="eastAsia"/>
-        </w:rPr>
-        <w:t xml:space="preserve"> SLO </w:t>
-      </w:r>
-      <w:r>
-        <w:rPr>
-          <w:rFonts w:hint="eastAsia"/>
-        </w:rPr>
-        <w:t>的策略并清理状态。</w:t>
+        <w:t>正式五次横向实验中，自研 scx_agent 相对默认调度器的平均 RPS 提升 79.02%，平均 P99 降低 60.04%，后台 CPU 保留率为 30.48%，超过 25% 公平性门槛；同一工具还如实记录 scx_simple、scx_qmap 和 scx_flatcg。批处理场景中，Agent 相对干扰组恢复 66.22% 吞吐。Canary 的接受与拒绝路径进一步证明系统既能执行优化，也能在 SLO 不达标时回滚 cgroup、scx 与 eBPF 状态。</w:t>
+      </w:r>
+      <w:r>
+        <w:rPr>
+          <w:rFonts w:hint="eastAsia"/>
+        </w:rPr>
+        <w:t>Redis 五次正式实验进一步验证了跨 workload 泛化：相对干扰组 QPS 提升 31.03%，P99 降低 38.75%，后台保留率为 61.25%。</w:t>
       </w:r>
     </w:p>
     <w:p>
@@ -15194,10 +13905,7 @@
         <w:jc w:val="both"/>
       </w:pPr>
       <w:r>
-        <w:t xml:space="preserve">Redis </w:t>
-      </w:r>
-      <w:r>
-        <w:t>尚未进入正式重复实验矩阵。</w:t>
+        <w:t>Redis 已纳入 5 次正式重复实验，但客户端与服务端仍同机运行，后续需增加独立压测节点以降低测量偏差。</w:t>
       </w:r>
     </w:p>
     <w:p>
@@ -15212,10 +13920,7 @@
         <w:jc w:val="both"/>
       </w:pPr>
       <w:r>
-        <w:t xml:space="preserve">network/security eBPF Agent </w:t>
-      </w:r>
-      <w:r>
-        <w:t>仍为扩展接口，不能宣称已完整实现。</w:t>
+        <w:t>四类 eBPF 扩展已形成真实加载、挂载、策略 map、统计与回滚闭环，但 network/security 当前为受控策略与审计语义，尚未达到生产级防火墙或完整强制访问控制系统的覆盖范围。</w:t>
       </w:r>
     </w:p>
     <w:p>
@@ -15267,13 +13972,7 @@
         <w:jc w:val="both"/>
       </w:pPr>
       <w:r>
-        <w:t>增加</w:t>
-      </w:r>
-      <w:r>
-        <w:t xml:space="preserve"> Redis</w:t>
-      </w:r>
-      <w:r>
-        <w:t>、编译任务和独立压测机的实验矩阵，并报告置信区间。</w:t>
+        <w:t>增加编译任务、独立压测机和更多硬件配置的实验矩阵，并继续报告置信区间。</w:t>
       </w:r>
     </w:p>
     <w:p>
@@ -15288,19 +13987,7 @@
         <w:jc w:val="both"/>
       </w:pPr>
       <w:r>
-        <w:t>完成真实</w:t>
-      </w:r>
-      <w:r>
-        <w:t xml:space="preserve"> sched_switch/sched_wakeup eBPF </w:t>
-      </w:r>
-      <w:r>
-        <w:t>延迟追踪</w:t>
-      </w:r>
-      <w:r>
-        <w:t xml:space="preserve"> hook</w:t>
-      </w:r>
-      <w:r>
-        <w:t>。</w:t>
+        <w:t>扩展 network/security eBPF 的生产级执行语义，并增加更细粒度的调度延迟分布与跨节点观测。</w:t>
       </w:r>
     </w:p>
     <w:p>

</xml_diff>